<commit_message>
feat: emissao de relatorios
</commit_message>
<xml_diff>
--- a/public/templates/modelo-romaneio1.docx
+++ b/public/templates/modelo-romaneio1.docx
@@ -532,7 +532,7 @@
                 <w:szCs w:val="20"/>
                 <w:rtl w:val="0"/>
               </w:rPr>
-              <w:t xml:space="preserve">Total de KG:</w:t>
+              <w:t xml:space="preserve">Total de KG: {{total-kg}}</w:t>
             </w:r>
           </w:p>
         </w:tc>
@@ -581,7 +581,7 @@
                 <w:szCs w:val="20"/>
                 <w:rtl w:val="0"/>
               </w:rPr>
-              <w:t xml:space="preserve">Rend. por @: </w:t>
+              <w:t xml:space="preserve">Rend. por @:  {{rend-arroba}}</w:t>
             </w:r>
           </w:p>
         </w:tc>
@@ -726,7 +726,7 @@
                 <w:szCs w:val="20"/>
                 <w:rtl w:val="0"/>
               </w:rPr>
-              <w:t xml:space="preserve">Valor Total Bruto: </w:t>
+              <w:t xml:space="preserve">Valor Total Bruto: {{valor-bruto}}</w:t>
             </w:r>
           </w:p>
         </w:tc>
@@ -769,7 +769,7 @@
                 <w:szCs w:val="20"/>
                 <w:rtl w:val="0"/>
               </w:rPr>
-              <w:t xml:space="preserve">1,5% Funrural:</w:t>
+              <w:t xml:space="preserve">1,5% Funrural: {{funrural}}</w:t>
             </w:r>
           </w:p>
         </w:tc>
@@ -862,7 +862,7 @@
                 <w:szCs w:val="20"/>
                 <w:rtl w:val="0"/>
               </w:rPr>
-              <w:t xml:space="preserve">0,20% Senar: </w:t>
+              <w:t xml:space="preserve">0,20% Senar: {{senar}}</w:t>
             </w:r>
           </w:p>
         </w:tc>

</xml_diff>